<commit_message>
docs: update verified GitHub repository URL across README, app, and academic reports
</commit_message>
<xml_diff>
--- a/docs/report.docx
+++ b/docs/report.docx
@@ -1446,7 +1446,7 @@
           <w:color w:val="0F172A"/>
           <w:sz w:val="25"/>
         </w:rPr>
-        <w:t>Appendix B: GitHub Instructions</w:t>
+        <w:t>Appendix B: Verified GitHub Repository</w:t>
       </w:r>
     </w:p>
     <w:p>
@@ -1454,7 +1454,11 @@
         <w:spacing w:after="120" w:line="276" w:lineRule="auto"/>
       </w:pPr>
       <w:r>
-        <w:t>Publish to GitHub via: git remote add origin &lt;url&gt;; git branch -M main; git push -u origin main</w:t>
+        <w:t>Repository URL: https://github.com/iamssakthi/Intelligent-Traffic-Signal-Optimization-Using-a-Finite-Markov-Decision-Process</w:t>
+        <w:br/>
+        <w:t>Clone command: git clone https://github.com/iamssakthi/Intelligent-Traffic-Signal-Optimization-Using-a-Finite-Markov-Decision-Process.git</w:t>
+        <w:br/>
+        <w:t>Push command: git push -u origin main</w:t>
       </w:r>
     </w:p>
     <w:sectPr>

</xml_diff>